<commit_message>
docs(patch): add workflow diagrams
Co-authored-by: Copilot <223556219+Copilot@users.noreply.github.com>
Copilot-Session: 5c82dd58-8da0-4249-b63f-8328260be747
</commit_message>
<xml_diff>
--- a/specs/002-patch-api/design.docx
+++ b/specs/002-patch-api/design.docx
@@ -2,7 +2,7 @@
 <file path=word/document.xml><?xml version="1.0" encoding="utf-8"?>
 <w:document xmlns:w="http://schemas.openxmlformats.org/wordprocessingml/2006/main" xmlns:m="http://schemas.openxmlformats.org/officeDocument/2006/math" xmlns:r="http://schemas.openxmlformats.org/officeDocument/2006/relationships" xmlns:o="urn:schemas-microsoft-com:office:office" xmlns:v="urn:schemas-microsoft-com:vml" xmlns:w10="urn:schemas-microsoft-com:office:word" xmlns:a="http://schemas.openxmlformats.org/drawingml/2006/main" xmlns:pic="http://schemas.openxmlformats.org/drawingml/2006/picture" xmlns:wp="http://schemas.openxmlformats.org/drawingml/2006/wordprocessingDrawing">
   <w:body>
-    <w:bookmarkStart w:id="24" w:name="portable-patch-api-design"/>
+    <w:bookmarkStart w:id="30" w:name="portable-patch-api-design"/>
     <w:p>
       <w:pPr>
         <w:pStyle w:val="Heading1"/>
@@ -160,7 +160,7 @@
         </w:tc>
       </w:tr>
     </w:tbl>
-    <w:bookmarkStart w:id="9" w:name="X2a0996b215cf614e9d115f6e6d52f107825a72b"/>
+    <w:bookmarkStart w:id="12" w:name="X2a0996b215cf614e9d115f6e6d52f107825a72b"/>
     <w:p>
       <w:pPr>
         <w:pStyle w:val="Heading2"/>
@@ -525,8 +525,81 @@
         </w:tc>
       </w:tr>
     </w:tbl>
-    <w:bookmarkEnd w:id="9"/>
-    <w:bookmarkStart w:id="10" w:name="Xcb976472555cccc627bca1aa0158f5e71e07379"/>
+    <w:p>
+      <w:pPr>
+        <w:pStyle w:val="BodyText"/>
+      </w:pPr>
+      <w:r>
+        <w:drawing>
+          <wp:inline>
+            <wp:extent cx="5334000" cy="3040380"/>
+            <wp:effectExtent b="0" l="0" r="0" t="0"/>
+            <wp:docPr descr="Portable PATCH request workflow" title="" id="10" name="Picture"/>
+            <a:graphic>
+              <a:graphicData uri="http://schemas.openxmlformats.org/drawingml/2006/picture">
+                <pic:pic>
+                  <pic:nvPicPr>
+                    <pic:cNvPr descr="images/patch-request-workflow.png" id="11" name="Picture"/>
+                    <pic:cNvPicPr>
+                      <a:picLocks noChangeArrowheads="1" noChangeAspect="1"/>
+                    </pic:cNvPicPr>
+                  </pic:nvPicPr>
+                  <pic:blipFill>
+                    <a:blip r:embed="rId9"/>
+                    <a:stretch>
+                      <a:fillRect/>
+                    </a:stretch>
+                  </pic:blipFill>
+                  <pic:spPr bwMode="auto">
+                    <a:xfrm>
+                      <a:off x="0" y="0"/>
+                      <a:ext cx="5334000" cy="3040380"/>
+                    </a:xfrm>
+                    <a:prstGeom prst="rect">
+                      <a:avLst/>
+                    </a:prstGeom>
+                    <a:noFill/>
+                    <a:ln w="9525">
+                      <a:noFill/>
+                      <a:headEnd/>
+                      <a:tailEnd/>
+                    </a:ln>
+                  </pic:spPr>
+                </pic:pic>
+              </a:graphicData>
+            </a:graphic>
+          </wp:inline>
+        </w:drawing>
+      </w:r>
+    </w:p>
+    <w:p>
+      <w:pPr>
+        <w:pStyle w:val="BodyText"/>
+      </w:pPr>
+      <w:r>
+        <w:rPr>
+          <w:i/>
+          <w:iCs/>
+        </w:rPr>
+        <w:t xml:space="preserve">Figure 1. Shared validation routes the request to one native write or rejects</w:t>
+      </w:r>
+      <w:r>
+        <w:rPr>
+          <w:i/>
+          <w:iCs/>
+        </w:rPr>
+        <w:t xml:space="preserve"> </w:t>
+      </w:r>
+      <w:r>
+        <w:rPr>
+          <w:i/>
+          <w:iCs/>
+        </w:rPr>
+        <w:t xml:space="preserve">an unsupported provider before I/O.</w:t>
+      </w:r>
+    </w:p>
+    <w:bookmarkEnd w:id="12"/>
+    <w:bookmarkStart w:id="13" w:name="Xcb976472555cccc627bca1aa0158f5e71e07379"/>
     <w:p>
       <w:pPr>
         <w:pStyle w:val="Heading2"/>
@@ -906,8 +979,8 @@
         <w:t xml:space="preserve">expiry.</w:t>
       </w:r>
     </w:p>
-    <w:bookmarkEnd w:id="10"/>
-    <w:bookmarkStart w:id="14" w:name="Xeaab99806607a97d642bde240371a0769f49f2b"/>
+    <w:bookmarkEnd w:id="13"/>
+    <w:bookmarkStart w:id="17" w:name="Xeaab99806607a97d642bde240371a0769f49f2b"/>
     <w:p>
       <w:pPr>
         <w:pStyle w:val="Heading2"/>
@@ -916,7 +989,7 @@
         <w:t xml:space="preserve">3. Cosmos DB</w:t>
       </w:r>
     </w:p>
-    <w:bookmarkStart w:id="11" w:name="request-flow"/>
+    <w:bookmarkStart w:id="14" w:name="request-flow"/>
     <w:p>
       <w:pPr>
         <w:pStyle w:val="Heading3"/>
@@ -1094,8 +1167,8 @@
         <w:t xml:space="preserve">predicate allows concurrent updates to unrelated fields.</w:t>
       </w:r>
     </w:p>
-    <w:bookmarkEnd w:id="11"/>
-    <w:bookmarkStart w:id="12" w:name="failure-classification"/>
+    <w:bookmarkEnd w:id="14"/>
+    <w:bookmarkStart w:id="15" w:name="failure-classification"/>
     <w:p>
       <w:pPr>
         <w:pStyle w:val="Heading3"/>
@@ -1285,8 +1358,8 @@
         </w:tc>
       </w:tr>
     </w:tbl>
-    <w:bookmarkEnd w:id="12"/>
-    <w:bookmarkStart w:id="13" w:name="provider-differences"/>
+    <w:bookmarkEnd w:id="15"/>
+    <w:bookmarkStart w:id="16" w:name="provider-differences"/>
     <w:p>
       <w:pPr>
         <w:pStyle w:val="Heading3"/>
@@ -1367,9 +1440,9 @@
         <w:t xml:space="preserve">rejected because its expiry cannot be preserved.</w:t>
       </w:r>
     </w:p>
-    <w:bookmarkEnd w:id="13"/>
-    <w:bookmarkEnd w:id="14"/>
-    <w:bookmarkStart w:id="18" w:name="X7d156430085ff97f949c5e680a14873a24536fe"/>
+    <w:bookmarkEnd w:id="16"/>
+    <w:bookmarkEnd w:id="17"/>
+    <w:bookmarkStart w:id="24" w:name="X7d156430085ff97f949c5e680a14873a24536fe"/>
     <w:p>
       <w:pPr>
         <w:pStyle w:val="Heading2"/>
@@ -1378,7 +1451,7 @@
         <w:t xml:space="preserve">4. DynamoDB</w:t>
       </w:r>
     </w:p>
-    <w:bookmarkStart w:id="15" w:name="request-flow-1"/>
+    <w:bookmarkStart w:id="18" w:name="request-flow-1"/>
     <w:p>
       <w:pPr>
         <w:pStyle w:val="Heading3"/>
@@ -1529,8 +1602,8 @@
         <w:t xml:space="preserve">special characters remain safe.</w:t>
       </w:r>
     </w:p>
-    <w:bookmarkEnd w:id="15"/>
-    <w:bookmarkStart w:id="16" w:name="failure-classification-1"/>
+    <w:bookmarkEnd w:id="18"/>
+    <w:bookmarkStart w:id="19" w:name="failure-classification-1"/>
     <w:p>
       <w:pPr>
         <w:pStyle w:val="Heading3"/>
@@ -1710,8 +1783,8 @@
         <w:t xml:space="preserve">is absent, the adapter uses one strongly consistent point read.</w:t>
       </w:r>
     </w:p>
-    <w:bookmarkEnd w:id="16"/>
-    <w:bookmarkStart w:id="17" w:name="provider-differences-1"/>
+    <w:bookmarkEnd w:id="19"/>
+    <w:bookmarkStart w:id="23" w:name="provider-differences-1"/>
     <w:p>
       <w:pPr>
         <w:pStyle w:val="Heading3"/>
@@ -1792,9 +1865,82 @@
         <w:t xml:space="preserve">preserved.</w:t>
       </w:r>
     </w:p>
-    <w:bookmarkEnd w:id="17"/>
-    <w:bookmarkEnd w:id="18"/>
-    <w:bookmarkStart w:id="19" w:name="Xf0edd262fb3c9fa90096829ed7a722f066d5cdd"/>
+    <w:p>
+      <w:pPr>
+        <w:pStyle w:val="FirstParagraph"/>
+      </w:pPr>
+      <w:r>
+        <w:drawing>
+          <wp:inline>
+            <wp:extent cx="5334000" cy="3547110"/>
+            <wp:effectExtent b="0" l="0" r="0" t="0"/>
+            <wp:docPr descr="Rejected PATCH classification workflow" title="" id="21" name="Picture"/>
+            <a:graphic>
+              <a:graphicData uri="http://schemas.openxmlformats.org/drawingml/2006/picture">
+                <pic:pic>
+                  <pic:nvPicPr>
+                    <pic:cNvPr descr="images/patch-rejection-workflow.png" id="22" name="Picture"/>
+                    <pic:cNvPicPr>
+                      <a:picLocks noChangeArrowheads="1" noChangeAspect="1"/>
+                    </pic:cNvPicPr>
+                  </pic:nvPicPr>
+                  <pic:blipFill>
+                    <a:blip r:embed="rId20"/>
+                    <a:stretch>
+                      <a:fillRect/>
+                    </a:stretch>
+                  </pic:blipFill>
+                  <pic:spPr bwMode="auto">
+                    <a:xfrm>
+                      <a:off x="0" y="0"/>
+                      <a:ext cx="5334000" cy="3547110"/>
+                    </a:xfrm>
+                    <a:prstGeom prst="rect">
+                      <a:avLst/>
+                    </a:prstGeom>
+                    <a:noFill/>
+                    <a:ln w="9525">
+                      <a:noFill/>
+                      <a:headEnd/>
+                      <a:tailEnd/>
+                    </a:ln>
+                  </pic:spPr>
+                </pic:pic>
+              </a:graphicData>
+            </a:graphic>
+          </wp:inline>
+        </w:drawing>
+      </w:r>
+    </w:p>
+    <w:p>
+      <w:pPr>
+        <w:pStyle w:val="BodyText"/>
+      </w:pPr>
+      <w:r>
+        <w:rPr>
+          <w:i/>
+          <w:iCs/>
+        </w:rPr>
+        <w:t xml:space="preserve">Figure 2. Cosmos and DynamoDB use different provider evidence but normalize</w:t>
+      </w:r>
+      <w:r>
+        <w:rPr>
+          <w:i/>
+          <w:iCs/>
+        </w:rPr>
+        <w:t xml:space="preserve"> </w:t>
+      </w:r>
+      <w:r>
+        <w:rPr>
+          <w:i/>
+          <w:iCs/>
+        </w:rPr>
+        <w:t xml:space="preserve">the rejection to the same portable error categories.</w:t>
+      </w:r>
+    </w:p>
+    <w:bookmarkEnd w:id="23"/>
+    <w:bookmarkEnd w:id="24"/>
+    <w:bookmarkStart w:id="25" w:name="Xf0edd262fb3c9fa90096829ed7a722f066d5cdd"/>
     <w:p>
       <w:pPr>
         <w:pStyle w:val="Heading2"/>
@@ -2081,8 +2227,8 @@
         <w:t xml:space="preserve">Applications requiring identical totals should use integral minor units.</w:t>
       </w:r>
     </w:p>
-    <w:bookmarkEnd w:id="19"/>
-    <w:bookmarkStart w:id="20" w:name="X7fa60c0b7a0a2443da1753ade75710691be70b4"/>
+    <w:bookmarkEnd w:id="25"/>
+    <w:bookmarkStart w:id="26" w:name="X7fa60c0b7a0a2443da1753ade75710691be70b4"/>
     <w:p>
       <w:pPr>
         <w:pStyle w:val="Heading2"/>
@@ -2169,8 +2315,8 @@
         <w:t xml:space="preserve">request may already have committed.</w:t>
       </w:r>
     </w:p>
-    <w:bookmarkEnd w:id="20"/>
-    <w:bookmarkStart w:id="21" w:name="X1896927e7b0964513706709279d4ccdd404dd70"/>
+    <w:bookmarkEnd w:id="26"/>
+    <w:bookmarkStart w:id="27" w:name="X1896927e7b0964513706709279d4ccdd404dd70"/>
     <w:p>
       <w:pPr>
         <w:pStyle w:val="Heading2"/>
@@ -2389,8 +2535,8 @@
         <w:t xml:space="preserve">and pricing.</w:t>
       </w:r>
     </w:p>
-    <w:bookmarkEnd w:id="21"/>
-    <w:bookmarkStart w:id="22" w:name="X0eee2407343aa6ccf244b2e08470f59cec59b7f"/>
+    <w:bookmarkEnd w:id="27"/>
+    <w:bookmarkStart w:id="28" w:name="X0eee2407343aa6ccf244b2e08470f59cec59b7f"/>
     <w:p>
       <w:pPr>
         <w:pStyle w:val="Heading2"/>
@@ -2496,8 +2642,8 @@
         <w:t xml:space="preserve">.</w:t>
       </w:r>
     </w:p>
-    <w:bookmarkEnd w:id="22"/>
-    <w:bookmarkStart w:id="23" w:name="X44053ebe33c720621d75098c1084c63186c80a6"/>
+    <w:bookmarkEnd w:id="28"/>
+    <w:bookmarkStart w:id="29" w:name="X44053ebe33c720621d75098c1084c63186c80a6"/>
     <w:p>
       <w:pPr>
         <w:pStyle w:val="Heading2"/>
@@ -2656,8 +2802,8 @@
         <w:t xml:space="preserve">multiclouddb-provider-dynamo/.../DynamoProviderClient.java</w:t>
       </w:r>
     </w:p>
-    <w:bookmarkEnd w:id="23"/>
-    <w:bookmarkEnd w:id="24"/>
+    <w:bookmarkEnd w:id="29"/>
+    <w:bookmarkEnd w:id="30"/>
     <w:sectPr>
       <w:footnotePr>
         <w:numRestart w:val="eachSect"/>

</xml_diff>

<commit_message>
docs(patch): explain portable limits
Co-authored-by: Copilot <223556219+Copilot@users.noreply.github.com>
Copilot-Session: 5c82dd58-8da0-4249-b63f-8328260be747
</commit_message>
<xml_diff>
--- a/specs/002-patch-api/design.docx
+++ b/specs/002-patch-api/design.docx
@@ -2,7 +2,7 @@
 <file path=word/document.xml><?xml version="1.0" encoding="utf-8"?>
 <w:document xmlns:w="http://schemas.openxmlformats.org/wordprocessingml/2006/main" xmlns:m="http://schemas.openxmlformats.org/officeDocument/2006/math" xmlns:r="http://schemas.openxmlformats.org/officeDocument/2006/relationships" xmlns:o="urn:schemas-microsoft-com:office:office" xmlns:v="urn:schemas-microsoft-com:vml" xmlns:w10="urn:schemas-microsoft-com:office:word" xmlns:a="http://schemas.openxmlformats.org/drawingml/2006/main" xmlns:pic="http://schemas.openxmlformats.org/drawingml/2006/picture" xmlns:wp="http://schemas.openxmlformats.org/drawingml/2006/wordprocessingDrawing">
   <w:body>
-    <w:bookmarkStart w:id="30" w:name="portable-patch-api-design"/>
+    <w:bookmarkStart w:id="31" w:name="portable-patch-api-design"/>
     <w:p>
       <w:pPr>
         <w:pStyle w:val="Heading1"/>
@@ -599,7 +599,7 @@
       </w:r>
     </w:p>
     <w:bookmarkEnd w:id="12"/>
-    <w:bookmarkStart w:id="13" w:name="Xcb976472555cccc627bca1aa0158f5e71e07379"/>
+    <w:bookmarkStart w:id="14" w:name="Xcb976472555cccc627bca1aa0158f5e71e07379"/>
     <w:p>
       <w:pPr>
         <w:pStyle w:val="Heading2"/>
@@ -920,28 +920,7 @@
         </w:numPr>
       </w:pPr>
       <w:r>
-        <w:t xml:space="preserve">portable fractional deltas from</w:t>
-      </w:r>
-      <w:r>
-        <w:t xml:space="preserve"> </w:t>
-      </w:r>
-      <w:r>
-        <w:rPr>
-          <w:rStyle w:val="VerbatimChar"/>
-        </w:rPr>
-        <w:t xml:space="preserve">1E-130</w:t>
-      </w:r>
-      <w:r>
-        <w:t xml:space="preserve"> </w:t>
-      </w:r>
-      <w:r>
-        <w:t xml:space="preserve">through</w:t>
-      </w:r>
-      <w:r>
-        <w:t xml:space="preserve"> </w:t>
-      </w:r>
-      <w:r>
-        <w:t xml:space="preserve">9,007,199,254,740,991 in magnitude;</w:t>
+        <w:t xml:space="preserve">portable fractional deltas within the range described below;</w:t>
       </w:r>
     </w:p>
     <w:p>
@@ -953,17 +932,294 @@
         </w:numPr>
       </w:pPr>
       <w:r>
-        <w:t xml:space="preserve">maximum 399 KB serialized request envelope.</w:t>
-      </w:r>
-    </w:p>
-    <w:p>
-      <w:pPr>
-        <w:pStyle w:val="FirstParagraph"/>
-      </w:pPr>
+        <w:t xml:space="preserve">maximum 399 KB (408,576-byte) serialized request envelope.</w:t>
+      </w:r>
+    </w:p>
+    <w:bookmarkStart w:id="13" w:name="why-these-limits"/>
+    <w:p>
+      <w:pPr>
+        <w:pStyle w:val="Heading3"/>
+      </w:pPr>
+      <w:r>
+        <w:t xml:space="preserve">Why these limits?</w:t>
+      </w:r>
+    </w:p>
+    <w:tbl>
+      <w:tblPr>
+        <w:tblStyle w:val="Table"/>
+        <w:tblW w:type="auto" w:w="0"/>
+        <w:tblLook w:firstRow="1" w:lastRow="0" w:firstColumn="0" w:lastColumn="0" w:noHBand="0" w:noVBand="0" w:val="0020"/>
+      </w:tblPr>
+      <w:tblGrid>
+        <w:gridCol w:w="2640"/>
+        <w:gridCol w:w="2640"/>
+        <w:gridCol w:w="2640"/>
+      </w:tblGrid>
+      <w:tr>
+        <w:trPr>
+          <w:tblHeader w:val="on"/>
+        </w:trPr>
+        <w:tc>
+          <w:tcPr/>
+          <w:p>
+            <w:pPr>
+              <w:pStyle w:val="Compact"/>
+            </w:pPr>
+            <w:r>
+              <w:t xml:space="preserve">Limit</w:t>
+            </w:r>
+          </w:p>
+        </w:tc>
+        <w:tc>
+          <w:tcPr/>
+          <w:p>
+            <w:pPr>
+              <w:pStyle w:val="Compact"/>
+            </w:pPr>
+            <w:r>
+              <w:t xml:space="preserve">Readable rule</w:t>
+            </w:r>
+          </w:p>
+        </w:tc>
+        <w:tc>
+          <w:tcPr/>
+          <w:p>
+            <w:pPr>
+              <w:pStyle w:val="Compact"/>
+            </w:pPr>
+            <w:r>
+              <w:t xml:space="preserve">Reason</w:t>
+            </w:r>
+          </w:p>
+        </w:tc>
+      </w:tr>
+      <w:tr>
+        <w:tc>
+          <w:tcPr/>
+          <w:p>
+            <w:pPr>
+              <w:pStyle w:val="Compact"/>
+            </w:pPr>
+            <w:r>
+              <w:t xml:space="preserve">Fractional</w:t>
+            </w:r>
+            <w:r>
+              <w:t xml:space="preserve"> </w:t>
+            </w:r>
+            <w:r>
+              <w:rPr>
+                <w:rStyle w:val="VerbatimChar"/>
+              </w:rPr>
+              <w:t xml:space="preserve">INCREMENT</w:t>
+            </w:r>
+          </w:p>
+        </w:tc>
+        <w:tc>
+          <w:tcPr/>
+          <w:p>
+            <w:pPr>
+              <w:pStyle w:val="Compact"/>
+            </w:pPr>
+            <w:r>
+              <w:rPr>
+                <w:rStyle w:val="VerbatimChar"/>
+              </w:rPr>
+              <w:t xml:space="preserve">delta = 0</w:t>
+            </w:r>
+            <w:r>
+              <w:t xml:space="preserve">, or a non-zero magnitude from</w:t>
+            </w:r>
+            <w:r>
+              <w:t xml:space="preserve"> </w:t>
+            </w:r>
+            <w:r>
+              <w:rPr>
+                <w:rStyle w:val="VerbatimChar"/>
+              </w:rPr>
+              <w:t xml:space="preserve">1E-130</w:t>
+            </w:r>
+            <w:r>
+              <w:t xml:space="preserve"> </w:t>
+            </w:r>
+            <w:r>
+              <w:t xml:space="preserve">to about</w:t>
+            </w:r>
+            <w:r>
+              <w:t xml:space="preserve"> </w:t>
+            </w:r>
+            <w:r>
+              <w:rPr>
+                <w:rStyle w:val="VerbatimChar"/>
+              </w:rPr>
+              <w:t xml:space="preserve">9.007E15</w:t>
+            </w:r>
+          </w:p>
+        </w:tc>
+        <w:tc>
+          <w:tcPr/>
+          <w:p>
+            <w:pPr>
+              <w:pStyle w:val="Compact"/>
+            </w:pPr>
+            <w:r>
+              <w:rPr>
+                <w:rStyle w:val="VerbatimChar"/>
+              </w:rPr>
+              <w:t xml:space="preserve">1E-130</w:t>
+            </w:r>
+            <w:r>
+              <w:t xml:space="preserve"> </w:t>
+            </w:r>
+            <w:r>
+              <w:t xml:space="preserve">is DynamoDB's minimum non-zero numeric magnitude. The exact upper value is</w:t>
+            </w:r>
+            <w:r>
+              <w:t xml:space="preserve"> </w:t>
+            </w:r>
+            <w:r>
+              <w:rPr>
+                <w:rStyle w:val="VerbatimChar"/>
+              </w:rPr>
+              <w:t xml:space="preserve">2^53 - 1</w:t>
+            </w:r>
+            <w:r>
+              <w:t xml:space="preserve">, or</w:t>
+            </w:r>
+            <w:r>
+              <w:t xml:space="preserve"> </w:t>
+            </w:r>
+            <w:r>
+              <w:rPr>
+                <w:rStyle w:val="VerbatimChar"/>
+              </w:rPr>
+              <w:t xml:space="preserve">9.007199254740991E15</w:t>
+            </w:r>
+            <w:r>
+              <w:t xml:space="preserve">. It is the largest safe integer: every integer through that magnitude is exactly representable in IEEE-754 binary64. This lets Cosmos DB and DynamoDB receive the same normalized delta.</w:t>
+            </w:r>
+          </w:p>
+        </w:tc>
+      </w:tr>
+      <w:tr>
+        <w:tc>
+          <w:tcPr/>
+          <w:p>
+            <w:pPr>
+              <w:pStyle w:val="Compact"/>
+            </w:pPr>
+            <w:r>
+              <w:t xml:space="preserve">PATCH request envelope</w:t>
+            </w:r>
+          </w:p>
+        </w:tc>
+        <w:tc>
+          <w:tcPr/>
+          <w:p>
+            <w:pPr>
+              <w:pStyle w:val="Compact"/>
+            </w:pPr>
+            <w:r>
+              <w:t xml:space="preserve">At most 399 KB (</w:t>
+            </w:r>
+            <w:r>
+              <w:rPr>
+                <w:rStyle w:val="VerbatimChar"/>
+              </w:rPr>
+              <w:t xml:space="preserve">408,576</w:t>
+            </w:r>
+            <w:r>
+              <w:t xml:space="preserve"> </w:t>
+            </w:r>
+            <w:r>
+              <w:t xml:space="preserve">bytes)</w:t>
+            </w:r>
+          </w:p>
+        </w:tc>
+        <w:tc>
+          <w:tcPr/>
+          <w:p>
+            <w:pPr>
+              <w:pStyle w:val="Compact"/>
+            </w:pPr>
+            <w:r>
+              <w:t xml:space="preserve">DynamoDB's 400 KB item limit is the lowest provider limit. The SDK subtracts 1 KB for provider-injected fields and representation overhead, then reuses that portable ceiling for the serialized PATCH operation list.</w:t>
+            </w:r>
+          </w:p>
+        </w:tc>
+      </w:tr>
+    </w:tbl>
+    <w:p>
+      <w:pPr>
+        <w:pStyle w:val="BodyText"/>
+      </w:pPr>
+      <w:r>
+        <w:t xml:space="preserve">The size calculation is</w:t>
+      </w:r>
+      <w:r>
+        <w:t xml:space="preserve"> </w:t>
+      </w:r>
       <w:r>
         <w:rPr>
           <w:rStyle w:val="VerbatimChar"/>
         </w:rPr>
+        <w:t xml:space="preserve">400 * 1024 - 1 * 1024 = 408,576</w:t>
+      </w:r>
+      <w:r>
+        <w:t xml:space="preserve"> </w:t>
+      </w:r>
+      <w:r>
+        <w:t xml:space="preserve">bytes.</w:t>
+      </w:r>
+    </w:p>
+    <w:p>
+      <w:pPr>
+        <w:pStyle w:val="BodyText"/>
+      </w:pPr>
+      <w:r>
+        <w:t xml:space="preserve">For PATCH, the 399 KB check measures each operation's type, path, and optional</w:t>
+      </w:r>
+      <w:r>
+        <w:t xml:space="preserve"> </w:t>
+      </w:r>
+      <w:r>
+        <w:t xml:space="preserve">value; a</w:t>
+      </w:r>
+      <w:r>
+        <w:t xml:space="preserve"> </w:t>
+      </w:r>
+      <w:r>
+        <w:rPr>
+          <w:rStyle w:val="VerbatimChar"/>
+        </w:rPr>
+        <w:t xml:space="preserve">REMOVE</w:t>
+      </w:r>
+      <w:r>
+        <w:t xml:space="preserve"> </w:t>
+      </w:r>
+      <w:r>
+        <w:t xml:space="preserve">still contributes its type and path. It bounds the request,</w:t>
+      </w:r>
+      <w:r>
+        <w:t xml:space="preserve"> </w:t>
+      </w:r>
+      <w:r>
+        <w:t xml:space="preserve">not the resulting document. A patch can still be rejected if its post-image</w:t>
+      </w:r>
+      <w:r>
+        <w:t xml:space="preserve"> </w:t>
+      </w:r>
+      <w:r>
+        <w:t xml:space="preserve">exceeds a provider's native item limit.</w:t>
+      </w:r>
+    </w:p>
+    <w:p>
+      <w:pPr>
+        <w:pStyle w:val="BodyText"/>
+      </w:pPr>
+      <w:r>
+        <w:rPr>
+          <w:rStyle w:val="VerbatimChar"/>
+        </w:rPr>
         <w:t xml:space="preserve">OperationOptions.ttlSeconds()</w:t>
       </w:r>
       <w:r>
@@ -980,7 +1236,8 @@
       </w:r>
     </w:p>
     <w:bookmarkEnd w:id="13"/>
-    <w:bookmarkStart w:id="17" w:name="Xeaab99806607a97d642bde240371a0769f49f2b"/>
+    <w:bookmarkEnd w:id="14"/>
+    <w:bookmarkStart w:id="18" w:name="Xeaab99806607a97d642bde240371a0769f49f2b"/>
     <w:p>
       <w:pPr>
         <w:pStyle w:val="Heading2"/>
@@ -989,7 +1246,7 @@
         <w:t xml:space="preserve">3. Cosmos DB</w:t>
       </w:r>
     </w:p>
-    <w:bookmarkStart w:id="14" w:name="request-flow"/>
+    <w:bookmarkStart w:id="15" w:name="request-flow"/>
     <w:p>
       <w:pPr>
         <w:pStyle w:val="Heading3"/>
@@ -1167,8 +1424,8 @@
         <w:t xml:space="preserve">predicate allows concurrent updates to unrelated fields.</w:t>
       </w:r>
     </w:p>
-    <w:bookmarkEnd w:id="14"/>
-    <w:bookmarkStart w:id="15" w:name="failure-classification"/>
+    <w:bookmarkEnd w:id="15"/>
+    <w:bookmarkStart w:id="16" w:name="failure-classification"/>
     <w:p>
       <w:pPr>
         <w:pStyle w:val="Heading3"/>
@@ -1358,8 +1615,8 @@
         </w:tc>
       </w:tr>
     </w:tbl>
-    <w:bookmarkEnd w:id="15"/>
-    <w:bookmarkStart w:id="16" w:name="provider-differences"/>
+    <w:bookmarkEnd w:id="16"/>
+    <w:bookmarkStart w:id="17" w:name="provider-differences"/>
     <w:p>
       <w:pPr>
         <w:pStyle w:val="Heading3"/>
@@ -1440,9 +1697,9 @@
         <w:t xml:space="preserve">rejected because its expiry cannot be preserved.</w:t>
       </w:r>
     </w:p>
-    <w:bookmarkEnd w:id="16"/>
     <w:bookmarkEnd w:id="17"/>
-    <w:bookmarkStart w:id="24" w:name="X7d156430085ff97f949c5e680a14873a24536fe"/>
+    <w:bookmarkEnd w:id="18"/>
+    <w:bookmarkStart w:id="25" w:name="X7d156430085ff97f949c5e680a14873a24536fe"/>
     <w:p>
       <w:pPr>
         <w:pStyle w:val="Heading2"/>
@@ -1451,7 +1708,7 @@
         <w:t xml:space="preserve">4. DynamoDB</w:t>
       </w:r>
     </w:p>
-    <w:bookmarkStart w:id="18" w:name="request-flow-1"/>
+    <w:bookmarkStart w:id="19" w:name="request-flow-1"/>
     <w:p>
       <w:pPr>
         <w:pStyle w:val="Heading3"/>
@@ -1602,8 +1859,8 @@
         <w:t xml:space="preserve">special characters remain safe.</w:t>
       </w:r>
     </w:p>
-    <w:bookmarkEnd w:id="18"/>
-    <w:bookmarkStart w:id="19" w:name="failure-classification-1"/>
+    <w:bookmarkEnd w:id="19"/>
+    <w:bookmarkStart w:id="20" w:name="failure-classification-1"/>
     <w:p>
       <w:pPr>
         <w:pStyle w:val="Heading3"/>
@@ -1783,8 +2040,8 @@
         <w:t xml:space="preserve">is absent, the adapter uses one strongly consistent point read.</w:t>
       </w:r>
     </w:p>
-    <w:bookmarkEnd w:id="19"/>
-    <w:bookmarkStart w:id="23" w:name="provider-differences-1"/>
+    <w:bookmarkEnd w:id="20"/>
+    <w:bookmarkStart w:id="24" w:name="provider-differences-1"/>
     <w:p>
       <w:pPr>
         <w:pStyle w:val="Heading3"/>
@@ -1874,18 +2131,18 @@
           <wp:inline>
             <wp:extent cx="5334000" cy="3547110"/>
             <wp:effectExtent b="0" l="0" r="0" t="0"/>
-            <wp:docPr descr="Rejected PATCH classification workflow" title="" id="21" name="Picture"/>
+            <wp:docPr descr="Rejected PATCH classification workflow" title="" id="22" name="Picture"/>
             <a:graphic>
               <a:graphicData uri="http://schemas.openxmlformats.org/drawingml/2006/picture">
                 <pic:pic>
                   <pic:nvPicPr>
-                    <pic:cNvPr descr="images/patch-rejection-workflow.png" id="22" name="Picture"/>
+                    <pic:cNvPr descr="images/patch-rejection-workflow.png" id="23" name="Picture"/>
                     <pic:cNvPicPr>
                       <a:picLocks noChangeArrowheads="1" noChangeAspect="1"/>
                     </pic:cNvPicPr>
                   </pic:nvPicPr>
                   <pic:blipFill>
-                    <a:blip r:embed="rId20"/>
+                    <a:blip r:embed="rId21"/>
                     <a:stretch>
                       <a:fillRect/>
                     </a:stretch>
@@ -1938,9 +2195,9 @@
         <w:t xml:space="preserve">the rejection to the same portable error categories.</w:t>
       </w:r>
     </w:p>
-    <w:bookmarkEnd w:id="23"/>
     <w:bookmarkEnd w:id="24"/>
-    <w:bookmarkStart w:id="25" w:name="Xf0edd262fb3c9fa90096829ed7a722f066d5cdd"/>
+    <w:bookmarkEnd w:id="25"/>
+    <w:bookmarkStart w:id="26" w:name="Xf0edd262fb3c9fa90096829ed7a722f066d5cdd"/>
     <w:p>
       <w:pPr>
         <w:pStyle w:val="Heading2"/>
@@ -2227,8 +2484,8 @@
         <w:t xml:space="preserve">Applications requiring identical totals should use integral minor units.</w:t>
       </w:r>
     </w:p>
-    <w:bookmarkEnd w:id="25"/>
-    <w:bookmarkStart w:id="26" w:name="X7fa60c0b7a0a2443da1753ade75710691be70b4"/>
+    <w:bookmarkEnd w:id="26"/>
+    <w:bookmarkStart w:id="27" w:name="X7fa60c0b7a0a2443da1753ade75710691be70b4"/>
     <w:p>
       <w:pPr>
         <w:pStyle w:val="Heading2"/>
@@ -2315,8 +2572,8 @@
         <w:t xml:space="preserve">request may already have committed.</w:t>
       </w:r>
     </w:p>
-    <w:bookmarkEnd w:id="26"/>
-    <w:bookmarkStart w:id="27" w:name="X1896927e7b0964513706709279d4ccdd404dd70"/>
+    <w:bookmarkEnd w:id="27"/>
+    <w:bookmarkStart w:id="28" w:name="X1896927e7b0964513706709279d4ccdd404dd70"/>
     <w:p>
       <w:pPr>
         <w:pStyle w:val="Heading2"/>
@@ -2535,8 +2792,8 @@
         <w:t xml:space="preserve">and pricing.</w:t>
       </w:r>
     </w:p>
-    <w:bookmarkEnd w:id="27"/>
-    <w:bookmarkStart w:id="28" w:name="X0eee2407343aa6ccf244b2e08470f59cec59b7f"/>
+    <w:bookmarkEnd w:id="28"/>
+    <w:bookmarkStart w:id="29" w:name="X0eee2407343aa6ccf244b2e08470f59cec59b7f"/>
     <w:p>
       <w:pPr>
         <w:pStyle w:val="Heading2"/>
@@ -2642,8 +2899,8 @@
         <w:t xml:space="preserve">.</w:t>
       </w:r>
     </w:p>
-    <w:bookmarkEnd w:id="28"/>
-    <w:bookmarkStart w:id="29" w:name="X44053ebe33c720621d75098c1084c63186c80a6"/>
+    <w:bookmarkEnd w:id="29"/>
+    <w:bookmarkStart w:id="30" w:name="X44053ebe33c720621d75098c1084c63186c80a6"/>
     <w:p>
       <w:pPr>
         <w:pStyle w:val="Heading2"/>
@@ -2802,8 +3059,8 @@
         <w:t xml:space="preserve">multiclouddb-provider-dynamo/.../DynamoProviderClient.java</w:t>
       </w:r>
     </w:p>
-    <w:bookmarkEnd w:id="29"/>
     <w:bookmarkEnd w:id="30"/>
+    <w:bookmarkEnd w:id="31"/>
     <w:sectPr>
       <w:footnotePr>
         <w:numRestart w:val="eachSect"/>

</xml_diff>

<commit_message>
docs(dynamo): explain ALL_OLD classification
Co-authored-by: Copilot <223556219+Copilot@users.noreply.github.com>
Copilot-Session: 5c82dd58-8da0-4249-b63f-8328260be747
</commit_message>
<xml_diff>
--- a/specs/002-patch-api/design.docx
+++ b/specs/002-patch-api/design.docx
@@ -1874,7 +1874,7 @@
         <w:pStyle w:val="FirstParagraph"/>
       </w:pPr>
       <w:r>
-        <w:t xml:space="preserve">The request asks for</w:t>
+        <w:t xml:space="preserve">The request sets</w:t>
       </w:r>
       <w:r>
         <w:t xml:space="preserve"> </w:t>
@@ -1883,19 +1883,116 @@
         <w:rPr>
           <w:rStyle w:val="VerbatimChar"/>
         </w:rPr>
+        <w:t xml:space="preserve">ReturnValuesOnConditionCheckFailure.ALL_OLD</w:t>
+      </w:r>
+      <w:r>
+        <w:t xml:space="preserve">. When the condition rejects the</w:t>
+      </w:r>
+      <w:r>
+        <w:t xml:space="preserve"> </w:t>
+      </w:r>
+      <w:r>
+        <w:t xml:space="preserve">update, DynamoDB attaches the item as it existed immediately before the</w:t>
+      </w:r>
+      <w:r>
+        <w:t xml:space="preserve"> </w:t>
+      </w:r>
+      <w:r>
+        <w:t xml:space="preserve">attempted write to the</w:t>
+      </w:r>
+      <w:r>
+        <w:t xml:space="preserve"> </w:t>
+      </w:r>
+      <w:r>
+        <w:rPr>
+          <w:rStyle w:val="VerbatimChar"/>
+        </w:rPr>
+        <w:t xml:space="preserve">ConditionalCheckFailedException</w:t>
+      </w:r>
+      <w:r>
+        <w:t xml:space="preserve">.</w:t>
+      </w:r>
+    </w:p>
+    <w:p>
+      <w:pPr>
+        <w:pStyle w:val="BodyText"/>
+      </w:pPr>
+      <w:r>
+        <w:rPr>
+          <w:rStyle w:val="VerbatimChar"/>
+        </w:rPr>
         <w:t xml:space="preserve">ALL_OLD</w:t>
       </w:r>
       <w:r>
         <w:t xml:space="preserve"> </w:t>
       </w:r>
       <w:r>
-        <w:t xml:space="preserve">on condition failure. The returned old image</w:t>
-      </w:r>
-      <w:r>
-        <w:t xml:space="preserve"> </w:t>
-      </w:r>
-      <w:r>
-        <w:t xml:space="preserve">normally identifies the portable error:</w:t>
+        <w:t xml:space="preserve">is failure evidence, not a successful-update response or a history</w:t>
+      </w:r>
+      <w:r>
+        <w:t xml:space="preserve"> </w:t>
+      </w:r>
+      <w:r>
+        <w:t xml:space="preserve">lookup. Because the condition failed, no mutation occurred, so this image is</w:t>
+      </w:r>
+      <w:r>
+        <w:t xml:space="preserve"> </w:t>
+      </w:r>
+      <w:r>
+        <w:t xml:space="preserve">also the current unchanged item at the time of rejection. It normally avoids a</w:t>
+      </w:r>
+      <w:r>
+        <w:t xml:space="preserve"> </w:t>
+      </w:r>
+      <w:r>
+        <w:t xml:space="preserve">separate</w:t>
+      </w:r>
+      <w:r>
+        <w:t xml:space="preserve"> </w:t>
+      </w:r>
+      <w:r>
+        <w:rPr>
+          <w:rStyle w:val="VerbatimChar"/>
+        </w:rPr>
+        <w:t xml:space="preserve">GetItem</w:t>
+      </w:r>
+      <w:r>
+        <w:t xml:space="preserve">.</w:t>
+      </w:r>
+    </w:p>
+    <w:p>
+      <w:pPr>
+        <w:pStyle w:val="BodyText"/>
+      </w:pPr>
+      <w:r>
+        <w:t xml:space="preserve">This matters because one</w:t>
+      </w:r>
+      <w:r>
+        <w:t xml:space="preserve"> </w:t>
+      </w:r>
+      <w:r>
+        <w:rPr>
+          <w:rStyle w:val="VerbatimChar"/>
+        </w:rPr>
+        <w:t xml:space="preserve">ConditionExpression</w:t>
+      </w:r>
+      <w:r>
+        <w:t xml:space="preserve"> </w:t>
+      </w:r>
+      <w:r>
+        <w:t xml:space="preserve">checks several rules, while the</w:t>
+      </w:r>
+      <w:r>
+        <w:t xml:space="preserve"> </w:t>
+      </w:r>
+      <w:r>
+        <w:t xml:space="preserve">native exception only reports that the overall condition failed. The SDK</w:t>
+      </w:r>
+      <w:r>
+        <w:t xml:space="preserve"> </w:t>
+      </w:r>
+      <w:r>
+        <w:t xml:space="preserve">inspects the returned image to identify the portable error:</w:t>
       </w:r>
     </w:p>
     <w:tbl>
@@ -2022,7 +2119,7 @@
         <w:pStyle w:val="BodyText"/>
       </w:pPr>
       <w:r>
-        <w:t xml:space="preserve">If</w:t>
+        <w:t xml:space="preserve">If the service, emulator, or exception does not include the</w:t>
       </w:r>
       <w:r>
         <w:t xml:space="preserve"> </w:t>
@@ -2037,7 +2134,34 @@
         <w:t xml:space="preserve"> </w:t>
       </w:r>
       <w:r>
-        <w:t xml:space="preserve">is absent, the adapter uses one strongly consistent point read.</w:t>
+        <w:t xml:space="preserve">image,</w:t>
+      </w:r>
+      <w:r>
+        <w:t xml:space="preserve"> </w:t>
+      </w:r>
+      <w:r>
+        <w:t xml:space="preserve">the adapter uses one strongly consistent</w:t>
+      </w:r>
+      <w:r>
+        <w:t xml:space="preserve"> </w:t>
+      </w:r>
+      <w:r>
+        <w:rPr>
+          <w:rStyle w:val="VerbatimChar"/>
+        </w:rPr>
+        <w:t xml:space="preserve">GetItem</w:t>
+      </w:r>
+      <w:r>
+        <w:t xml:space="preserve"> </w:t>
+      </w:r>
+      <w:r>
+        <w:t xml:space="preserve">as a rejection-only</w:t>
+      </w:r>
+      <w:r>
+        <w:t xml:space="preserve"> </w:t>
+      </w:r>
+      <w:r>
+        <w:t xml:space="preserve">fallback. A successful PATCH never performs this read.</w:t>
       </w:r>
     </w:p>
     <w:bookmarkEnd w:id="20"/>
@@ -2192,7 +2316,50 @@
           <w:i/>
           <w:iCs/>
         </w:rPr>
-        <w:t xml:space="preserve">the rejection to the same portable error categories.</w:t>
+        <w:t xml:space="preserve">the rejection to the same portable error categories. DynamoDB's</w:t>
+      </w:r>
+      <w:r>
+        <w:rPr>
+          <w:i/>
+          <w:iCs/>
+        </w:rPr>
+        <w:t xml:space="preserve"> </w:t>
+      </w:r>
+      <w:r>
+        <w:rPr>
+          <w:rStyle w:val="VerbatimChar"/>
+          <w:i/>
+          <w:iCs/>
+        </w:rPr>
+        <w:t xml:space="preserve">ALL_OLD</w:t>
+      </w:r>
+      <w:r>
+        <w:rPr>
+          <w:i/>
+          <w:iCs/>
+        </w:rPr>
+        <w:t xml:space="preserve"> </w:t>
+      </w:r>
+      <w:r>
+        <w:rPr>
+          <w:i/>
+          <w:iCs/>
+        </w:rPr>
+        <w:t xml:space="preserve">is</w:t>
+      </w:r>
+      <w:r>
+        <w:rPr>
+          <w:i/>
+          <w:iCs/>
+        </w:rPr>
+        <w:t xml:space="preserve"> </w:t>
+      </w:r>
+      <w:r>
+        <w:rPr>
+          <w:i/>
+          <w:iCs/>
+        </w:rPr>
+        <w:t xml:space="preserve">the pre-write item attached to the failed conditional request.</w:t>
       </w:r>
     </w:p>
     <w:bookmarkEnd w:id="24"/>

</xml_diff>